<commit_message>
Independent submission: author line, no clock times, LLM usage statement, template build (md2apart.py), submission repo export
</commit_message>
<xml_diff>
--- a/projects/2026-10-apart-collusion-sprint/report/GUIDE.docx
+++ b/projects/2026-10-apart-collusion-sprint/report/GUIDE.docx
@@ -530,92 +530,6 @@
                 <w:szCs w:val="19"/>
               </w:rPr>
               <w:t xml:space="preserve">Before and on 2026-10-23</w:t>
-            </w:r>
-          </w:p>
-        </w:tc>
-      </w:tr>
-      <w:tr>
-        <w:trPr>
-          <w:tblHeader w:val="false"/>
-        </w:trPr>
-        <w:tc>
-          <w:tcPr>
-            <w:tcW w:type="dxa" w:w="3900"/>
-            <w:tcBorders>
-              <w:top w:val="single" w:color="999999" w:sz="4"/>
-              <w:left w:val="single" w:color="999999" w:sz="4"/>
-              <w:bottom w:val="single" w:color="999999" w:sz="4"/>
-              <w:right w:val="single" w:color="999999" w:sz="4"/>
-            </w:tcBorders>
-            <w:tcMar>
-              <w:top w:type="dxa" w:w="60"/>
-              <w:left w:type="dxa" w:w="90"/>
-              <w:bottom w:type="dxa" w:w="60"/>
-              <w:right w:type="dxa" w:w="90"/>
-            </w:tcMar>
-          </w:tcPr>
-          <w:p>
-            <w:r>
-              <w:rPr>
-                <w:rFonts w:ascii="Calibri" w:cs="Calibri" w:eastAsia="Calibri" w:hAnsi="Calibri"/>
-                <w:sz w:val="19"/>
-                <w:szCs w:val="19"/>
-              </w:rPr>
-              <w:t xml:space="preserve">Three concepts from the Grid Nowcast ontology work: claim versus accepted fact, source lineage, review decision as a separate act</w:t>
-            </w:r>
-          </w:p>
-        </w:tc>
-        <w:tc>
-          <w:tcPr>
-            <w:tcW w:type="dxa" w:w="3900"/>
-            <w:tcBorders>
-              <w:top w:val="single" w:color="999999" w:sz="4"/>
-              <w:left w:val="single" w:color="999999" w:sz="4"/>
-              <w:bottom w:val="single" w:color="999999" w:sz="4"/>
-              <w:right w:val="single" w:color="999999" w:sz="4"/>
-            </w:tcBorders>
-            <w:tcMar>
-              <w:top w:type="dxa" w:w="60"/>
-              <w:left w:type="dxa" w:w="90"/>
-              <w:bottom w:type="dxa" w:w="60"/>
-              <w:right w:type="dxa" w:w="90"/>
-            </w:tcMar>
-          </w:tcPr>
-          <w:p>
-            <w:r>
-              <w:rPr>
-                <w:rFonts w:ascii="Calibri" w:cs="Calibri" w:eastAsia="Calibri" w:hAnsi="Calibri"/>
-                <w:sz w:val="19"/>
-                <w:szCs w:val="19"/>
-              </w:rPr>
-              <w:t xml:space="preserve">You, before the sprint. This is preexisting work and the paper says so</w:t>
-            </w:r>
-          </w:p>
-        </w:tc>
-        <w:tc>
-          <w:tcPr>
-            <w:tcW w:type="dxa" w:w="1560"/>
-            <w:tcBorders>
-              <w:top w:val="single" w:color="999999" w:sz="4"/>
-              <w:left w:val="single" w:color="999999" w:sz="4"/>
-              <w:bottom w:val="single" w:color="999999" w:sz="4"/>
-              <w:right w:val="single" w:color="999999" w:sz="4"/>
-            </w:tcBorders>
-            <w:tcMar>
-              <w:top w:type="dxa" w:w="60"/>
-              <w:left w:type="dxa" w:w="90"/>
-              <w:bottom w:type="dxa" w:w="60"/>
-              <w:right w:type="dxa" w:w="90"/>
-            </w:tcMar>
-          </w:tcPr>
-          <w:p>
-            <w:r>
-              <w:rPr>
-                <w:rFonts w:ascii="Calibri" w:cs="Calibri" w:eastAsia="Calibri" w:hAnsi="Calibri"/>
-                <w:sz w:val="19"/>
-                <w:szCs w:val="19"/>
-              </w:rPr>
-              <w:t xml:space="preserve">Before 2026-10-23</w:t>
             </w:r>
           </w:p>
         </w:tc>
@@ -8621,7 +8535,7 @@
                 <w:sz w:val="19"/>
                 <w:szCs w:val="19"/>
               </w:rPr>
-              <w:t xml:space="preserve">2026-10-26, about 06:15 UTC</w:t>
+              <w:t xml:space="preserve">2026-10-26, before any language-model run</w:t>
             </w:r>
           </w:p>
         </w:tc>
@@ -22290,7 +22204,7 @@
         <w:rPr>
           <w:rFonts w:ascii="Calibri" w:cs="Calibri" w:eastAsia="Calibri" w:hAnsi="Calibri"/>
         </w:rPr>
-        <w:t xml:space="preserve">The sprint preregistration was frozen on 2026-10-26 at about 06:15 UTC (14:15 Manila). The language-model runs started at 06:16:51 UTC. The file records what was seen before the freeze. That was the full scripted demo and a 2-trajectory smoke test (family F01, regime E1, DeepSeek chat). The smoke test showed reworded plans that the keyword rule missed. No rule was changed after it.</w:t>
+        <w:t xml:space="preserve">The sprint preregistration was frozen on 2026-10-26, before any language-model run. The language-model runs started at 06:16:51 UTC. The file records what was seen before the freeze. That was the full scripted demo and a 2-trajectory smoke test (family F01, regime E1, DeepSeek chat). The smoke test showed reworded plans that the keyword rule missed. No rule was changed after it.</w:t>
       </w:r>
     </w:p>
     <w:p>

</xml_diff>